<commit_message>
feat: added object detection for floorplan conversion, object creation in canvas, ppr form generation, statement form generation, leading question per incident type
</commit_message>
<xml_diff>
--- a/src/assets/templates/fire-investigation-report.docx
+++ b/src/assets/templates/fire-investigation-report.docx
@@ -1316,7 +1316,7 @@
                 <w:rFonts w:ascii="Arial" w:hAnsi="Arial"/>
                 <w:sz w:val="24"/>
               </w:rPr>
-              <w:t>Designation</w:t>
+              <w:t>Designation: {tenantDesignation}</w:t>
             </w:r>
           </w:p>
         </w:tc>
@@ -1449,7 +1449,7 @@
                 <w:rFonts w:ascii="Arial" w:hAnsi="Arial"/>
                 <w:sz w:val="24"/>
               </w:rPr>
-              <w:t>Nationality</w:t>
+              <w:t>Nationality: {tenantNationality}</w:t>
             </w:r>
           </w:p>
         </w:tc>
@@ -1499,7 +1499,7 @@
                 <w:sz w:val="24"/>
               </w:rPr>
               <w:lastRenderedPageBreak/>
-              <w:t xml:space="preserve">   Address</w:t>
+              <w:t xml:space="preserve">   Address: {tenantAddress}</w:t>
             </w:r>
           </w:p>
         </w:tc>
@@ -3066,493 +3066,13 @@
         </w:tc>
       </w:tr>
       <w:tr>
-        <w:tblPrEx>
-          <w:tblCellMar>
-            <w:top w:w="0" w:type="dxa"/>
-            <w:bottom w:w="0" w:type="dxa"/>
-          </w:tblCellMar>
-        </w:tblPrEx>
-        <w:trPr>
-          <w:cantSplit/>
-        </w:trPr>
         <w:tc>
           <w:tcPr>
-            <w:tcW w:w="9772" w:type="dxa"/>
             <w:gridSpan w:val="2"/>
           </w:tcPr>
           <w:p>
-            <w:pPr>
-              <w:pStyle w:val="BodyText"/>
-              <w:rPr>
-                <w:i w:val="0"/>
-              </w:rPr>
-            </w:pPr>
-            <w:r>
-              <w:rPr>
-                <w:i w:val="0"/>
-              </w:rPr>
-              <w:tab/>
-            </w:r>
-          </w:p>
-          <w:p>
-            <w:pPr>
-              <w:pStyle w:val="BodyText"/>
-              <w:numPr>
-                <w:ilvl w:val="0"/>
-                <w:numId w:val="14"/>
-              </w:numPr>
-              <w:ind w:left="640" w:right="412" w:hanging="425"/>
-              <w:jc w:val="both"/>
-              <w:rPr>
-                <w:i w:val="0"/>
-                <w:color w:val="auto"/>
-              </w:rPr>
-            </w:pPr>
-            <w:r>
-              <w:rPr>
-                <w:i w:val="0"/>
-                <w:color w:val="auto"/>
-              </w:rPr>
-              <w:t xml:space="preserve">Interview conducted with </w:t>
-            </w:r>
-            <w:r>
-              <w:rPr>
-                <w:i w:val="0"/>
-                <w:color w:val="auto"/>
-              </w:rPr>
-              <w:t xml:space="preserve">Mr </w:t>
-            </w:r>
-            <w:r>
-              <w:rPr>
-                <w:i w:val="0"/>
-                <w:color w:val="auto"/>
-              </w:rPr>
-              <w:t>{interviewee1Name}</w:t>
-            </w:r>
-            <w:r>
-              <w:rPr>
-                <w:i w:val="0"/>
-                <w:color w:val="auto"/>
-              </w:rPr>
-              <w:t xml:space="preserve">, </w:t>
-            </w:r>
-            <w:r>
-              <w:rPr>
-                <w:i w:val="0"/>
-                <w:color w:val="auto"/>
-              </w:rPr>
-              <w:t>revealed the following: {interviewee2Facts}</w:t>
-            </w:r>
-          </w:p>
-          <w:p>
-            <w:pPr>
-              <w:pStyle w:val="BodyText"/>
-              <w:ind w:right="412"/>
-              <w:jc w:val="both"/>
-              <w:rPr>
-                <w:i w:val="0"/>
-                <w:color w:val="auto"/>
-              </w:rPr>
-            </w:pPr>
-          </w:p>
-          <w:p>
-            <w:pPr>
-              <w:pStyle w:val="BodyText"/>
-              <w:numPr>
-                <w:ilvl w:val="0"/>
-                <w:numId w:val="22"/>
-              </w:numPr>
-              <w:ind w:left="1065" w:right="412" w:hanging="425"/>
-              <w:jc w:val="both"/>
-              <w:rPr>
-                <w:i w:val="0"/>
-                <w:color w:val="auto"/>
-              </w:rPr>
-            </w:pPr>
-          </w:p>
-          <w:p>
-            <w:pPr>
-              <w:pStyle w:val="BodyText"/>
-              <w:ind w:right="412"/>
-              <w:jc w:val="both"/>
-              <w:rPr>
-                <w:i w:val="0"/>
-                <w:color w:val="auto"/>
-              </w:rPr>
-            </w:pPr>
-          </w:p>
-          <w:p>
-            <w:pPr>
-              <w:pStyle w:val="BodyText"/>
-              <w:numPr>
-                <w:ilvl w:val="0"/>
-                <w:numId w:val="22"/>
-              </w:numPr>
-              <w:ind w:left="1065" w:right="412" w:hanging="425"/>
-              <w:jc w:val="both"/>
-              <w:rPr>
-                <w:i w:val="0"/>
-                <w:color w:val="auto"/>
-              </w:rPr>
-            </w:pPr>
-          </w:p>
-          <w:p>
-            <w:pPr>
-              <w:pStyle w:val="BodyText"/>
-              <w:ind w:left="1065" w:right="412"/>
-              <w:jc w:val="both"/>
-              <w:rPr>
-                <w:i w:val="0"/>
-                <w:color w:val="auto"/>
-              </w:rPr>
-            </w:pPr>
-          </w:p>
-          <w:p>
-            <w:pPr>
-              <w:pStyle w:val="BodyText"/>
-              <w:numPr>
-                <w:ilvl w:val="0"/>
-                <w:numId w:val="22"/>
-              </w:numPr>
-              <w:ind w:left="1065" w:right="412" w:hanging="425"/>
-              <w:jc w:val="both"/>
-              <w:rPr>
-                <w:i w:val="0"/>
-                <w:color w:val="auto"/>
-              </w:rPr>
-            </w:pPr>
-          </w:p>
-          <w:p>
-            <w:pPr>
-              <w:pStyle w:val="BodyText"/>
-              <w:ind w:right="412"/>
-              <w:jc w:val="both"/>
-              <w:rPr>
-                <w:i w:val="0"/>
-                <w:color w:val="auto"/>
-              </w:rPr>
-            </w:pPr>
-          </w:p>
-        </w:tc>
-      </w:tr>
-      <w:tr>
-        <w:tblPrEx>
-          <w:tblCellMar>
-            <w:top w:w="0" w:type="dxa"/>
-            <w:bottom w:w="0" w:type="dxa"/>
-          </w:tblCellMar>
-        </w:tblPrEx>
-        <w:tc>
-          <w:tcPr>
-            <w:tcW w:w="4433" w:type="dxa"/>
-          </w:tcPr>
-          <w:p>
-            <w:pPr>
-              <w:rPr>
-                <w:rFonts w:ascii="Arial" w:hAnsi="Arial"/>
-                <w:sz w:val="24"/>
-              </w:rPr>
-            </w:pPr>
-            <w:r>
-              <w:rPr>
-                <w:rFonts w:ascii="Arial" w:hAnsi="Arial"/>
-                <w:sz w:val="24"/>
-              </w:rPr>
-              <w:t xml:space="preserve">   Name of Interviewee: {interviewee2Name} {interviewee1Name}</w:t>
-            </w:r>
-          </w:p>
-        </w:tc>
-        <w:tc>
-          <w:tcPr>
-            <w:tcW w:w="5339" w:type="dxa"/>
-          </w:tcPr>
-          <w:p>
-            <w:pPr>
-              <w:pStyle w:val="Heading3"/>
-            </w:pPr>
-          </w:p>
-        </w:tc>
-      </w:tr>
-      <w:tr>
-        <w:tblPrEx>
-          <w:tblCellMar>
-            <w:top w:w="0" w:type="dxa"/>
-            <w:bottom w:w="0" w:type="dxa"/>
-          </w:tblCellMar>
-        </w:tblPrEx>
-        <w:tc>
-          <w:tcPr>
-            <w:tcW w:w="4433" w:type="dxa"/>
-          </w:tcPr>
-          <w:p>
-            <w:pPr>
-              <w:ind w:left="217"/>
-              <w:rPr>
-                <w:rFonts w:ascii="Arial" w:hAnsi="Arial"/>
-                <w:sz w:val="24"/>
-              </w:rPr>
-            </w:pPr>
-            <w:r>
-              <w:rPr>
-                <w:rFonts w:ascii="Arial" w:hAnsi="Arial"/>
-                <w:sz w:val="24"/>
-              </w:rPr>
-              <w:t>Designation: {tenantDesignation}</w:t>
-            </w:r>
-          </w:p>
-        </w:tc>
-        <w:tc>
-          <w:tcPr>
-            <w:tcW w:w="5339" w:type="dxa"/>
-          </w:tcPr>
-          <w:p>
-            <w:pPr>
-              <w:suppressAutoHyphens/>
-              <w:jc w:val="both"/>
-              <w:rPr>
-                <w:rFonts w:ascii="Arial" w:hAnsi="Arial"/>
-                <w:spacing w:val="-2"/>
-                <w:sz w:val="24"/>
-              </w:rPr>
-            </w:pPr>
-          </w:p>
-        </w:tc>
-      </w:tr>
-      <w:tr>
-        <w:tblPrEx>
-          <w:tblCellMar>
-            <w:top w:w="0" w:type="dxa"/>
-            <w:bottom w:w="0" w:type="dxa"/>
-          </w:tblCellMar>
-        </w:tblPrEx>
-        <w:tc>
-          <w:tcPr>
-            <w:tcW w:w="4433" w:type="dxa"/>
-          </w:tcPr>
-          <w:p>
-            <w:pPr>
-              <w:rPr>
-                <w:rFonts w:ascii="Arial" w:hAnsi="Arial"/>
-                <w:sz w:val="24"/>
-              </w:rPr>
-            </w:pPr>
-            <w:r>
-              <w:rPr>
-                <w:rFonts w:ascii="Arial" w:hAnsi="Arial"/>
-                <w:sz w:val="24"/>
-              </w:rPr>
-              <w:t xml:space="preserve">   </w:t>
-            </w:r>
-            <w:r>
-              <w:rPr>
-                <w:rFonts w:ascii="Arial" w:hAnsi="Arial"/>
-                <w:sz w:val="24"/>
-              </w:rPr>
-              <w:t>NRIC</w:t>
-            </w:r>
-            <w:r>
-              <w:rPr>
-                <w:rFonts w:ascii="Arial" w:hAnsi="Arial"/>
-                <w:sz w:val="24"/>
-              </w:rPr>
-              <w:t xml:space="preserve"> /</w:t>
-            </w:r>
-            <w:r>
-              <w:rPr>
-                <w:rFonts w:ascii="Arial" w:hAnsi="Arial"/>
-                <w:sz w:val="24"/>
-              </w:rPr>
-              <w:t xml:space="preserve"> </w:t>
-            </w:r>
-            <w:r>
-              <w:rPr>
-                <w:rFonts w:ascii="Arial" w:hAnsi="Arial"/>
-                <w:sz w:val="24"/>
-              </w:rPr>
-              <w:t xml:space="preserve">FIN </w:t>
-            </w:r>
-            <w:r>
-              <w:rPr>
-                <w:rFonts w:ascii="Arial" w:hAnsi="Arial"/>
-                <w:sz w:val="24"/>
-              </w:rPr>
-              <w:t>No.:</w:t>
-            </w:r>
-          </w:p>
-        </w:tc>
-        <w:tc>
-          <w:tcPr>
-            <w:tcW w:w="5339" w:type="dxa"/>
-          </w:tcPr>
-          <w:p>
-            <w:pPr>
-              <w:suppressAutoHyphens/>
-              <w:jc w:val="both"/>
-              <w:rPr>
-                <w:rFonts w:ascii="Arial" w:hAnsi="Arial"/>
-                <w:spacing w:val="-2"/>
-                <w:sz w:val="24"/>
-              </w:rPr>
-            </w:pPr>
-          </w:p>
-        </w:tc>
-      </w:tr>
-      <w:tr>
-        <w:tblPrEx>
-          <w:tblCellMar>
-            <w:top w:w="0" w:type="dxa"/>
-            <w:bottom w:w="0" w:type="dxa"/>
-          </w:tblCellMar>
-        </w:tblPrEx>
-        <w:tc>
-          <w:tcPr>
-            <w:tcW w:w="4433" w:type="dxa"/>
-          </w:tcPr>
-          <w:p>
-            <w:pPr>
-              <w:rPr>
-                <w:rFonts w:ascii="Arial" w:hAnsi="Arial"/>
-                <w:sz w:val="24"/>
-              </w:rPr>
-            </w:pPr>
-            <w:r>
-              <w:rPr>
-                <w:rFonts w:ascii="Arial" w:hAnsi="Arial"/>
-                <w:sz w:val="24"/>
-              </w:rPr>
-              <w:t xml:space="preserve">   Nationality</w:t>
-            </w:r>
-            <w:r>
-              <w:rPr>
-                <w:rFonts w:ascii="Arial" w:hAnsi="Arial"/>
-                <w:sz w:val="24"/>
-              </w:rPr>
-              <w:t>:</w:t>
-            </w:r>
-          </w:p>
-        </w:tc>
-        <w:tc>
-          <w:tcPr>
-            <w:tcW w:w="5339" w:type="dxa"/>
-          </w:tcPr>
-          <w:p>
-            <w:pPr>
-              <w:rPr>
-                <w:rFonts w:ascii="Arial" w:hAnsi="Arial"/>
-                <w:sz w:val="24"/>
-              </w:rPr>
-            </w:pPr>
-          </w:p>
-        </w:tc>
-      </w:tr>
-      <w:tr>
-        <w:tblPrEx>
-          <w:tblCellMar>
-            <w:top w:w="0" w:type="dxa"/>
-            <w:bottom w:w="0" w:type="dxa"/>
-          </w:tblCellMar>
-        </w:tblPrEx>
-        <w:tc>
-          <w:tcPr>
-            <w:tcW w:w="4433" w:type="dxa"/>
-          </w:tcPr>
-          <w:p>
-            <w:pPr>
-              <w:rPr>
-                <w:rFonts w:ascii="Arial" w:hAnsi="Arial"/>
-                <w:sz w:val="24"/>
-              </w:rPr>
-            </w:pPr>
-            <w:r>
-              <w:rPr>
-                <w:rFonts w:ascii="Arial" w:hAnsi="Arial"/>
-                <w:sz w:val="24"/>
-              </w:rPr>
-              <w:t xml:space="preserve">   Address</w:t>
-            </w:r>
-            <w:r>
-              <w:rPr>
-                <w:rFonts w:ascii="Arial" w:hAnsi="Arial"/>
-                <w:sz w:val="24"/>
-              </w:rPr>
-              <w:t>:</w:t>
-            </w:r>
-          </w:p>
-        </w:tc>
-        <w:tc>
-          <w:tcPr>
-            <w:tcW w:w="5339" w:type="dxa"/>
-          </w:tcPr>
-          <w:p>
-            <w:pPr>
-              <w:suppressAutoHyphens/>
-              <w:rPr>
-                <w:rFonts w:ascii="Arial" w:hAnsi="Arial" w:cs="Arial"/>
-                <w:sz w:val="24"/>
-                <w:szCs w:val="24"/>
-              </w:rPr>
-            </w:pPr>
-          </w:p>
-        </w:tc>
-      </w:tr>
-      <w:tr>
-        <w:tblPrEx>
-          <w:tblCellMar>
-            <w:top w:w="0" w:type="dxa"/>
-            <w:bottom w:w="0" w:type="dxa"/>
-          </w:tblCellMar>
-        </w:tblPrEx>
-        <w:tc>
-          <w:tcPr>
-            <w:tcW w:w="4433" w:type="dxa"/>
-          </w:tcPr>
-          <w:p>
-            <w:pPr>
-              <w:rPr>
-                <w:rFonts w:ascii="Arial" w:hAnsi="Arial"/>
-                <w:sz w:val="24"/>
-              </w:rPr>
-            </w:pPr>
-            <w:r>
-              <w:rPr>
-                <w:rFonts w:ascii="Arial" w:hAnsi="Arial"/>
-                <w:sz w:val="24"/>
-              </w:rPr>
-              <w:t xml:space="preserve">   </w:t>
-            </w:r>
-            <w:r>
-              <w:rPr>
-                <w:rFonts w:ascii="Arial" w:hAnsi="Arial"/>
-                <w:sz w:val="24"/>
-              </w:rPr>
-              <w:t>Contact No.</w:t>
-            </w:r>
-          </w:p>
-        </w:tc>
-        <w:tc>
-          <w:tcPr>
-            <w:tcW w:w="5339" w:type="dxa"/>
-          </w:tcPr>
-          <w:p>
-            <w:pPr>
-              <w:rPr>
-                <w:rFonts w:ascii="Arial" w:hAnsi="Arial"/>
-                <w:sz w:val="24"/>
-              </w:rPr>
-            </w:pPr>
-            <w:r>
-              <w:rPr>
-                <w:rFonts w:ascii="Arial" w:hAnsi="Arial"/>
-                <w:sz w:val="24"/>
-              </w:rPr>
-              <w:t>(Mobile)</w:t>
-            </w:r>
-            <w:r>
-              <w:rPr>
-                <w:rFonts w:ascii="Arial" w:hAnsi="Arial"/>
-                <w:sz w:val="24"/>
-              </w:rPr>
-              <w:t xml:space="preserve"> (Home) (Office)</w:t>
+            <w:r>
+              <w:t>{#interviewees}</w:t>
             </w:r>
           </w:p>
         </w:tc>
@@ -3575,12 +3095,16 @@
           <w:p>
             <w:pPr>
               <w:pStyle w:val="BodyText"/>
-              <w:jc w:val="both"/>
               <w:rPr>
                 <w:i w:val="0"/>
-                <w:color w:val="auto"/>
-              </w:rPr>
-            </w:pPr>
+              </w:rPr>
+            </w:pPr>
+            <w:r>
+              <w:rPr>
+                <w:i w:val="0"/>
+              </w:rPr>
+              <w:tab/>
+            </w:r>
           </w:p>
           <w:p>
             <w:pPr>
@@ -3589,7 +3113,7 @@
                 <w:ilvl w:val="0"/>
                 <w:numId w:val="14"/>
               </w:numPr>
-              <w:ind w:left="639" w:right="412" w:hanging="425"/>
+              <w:ind w:left="640" w:right="412" w:hanging="425"/>
               <w:jc w:val="both"/>
               <w:rPr>
                 <w:i w:val="0"/>
@@ -3608,21 +3132,7 @@
                 <w:i w:val="0"/>
                 <w:color w:val="auto"/>
               </w:rPr>
-              <w:t xml:space="preserve">Mr </w:t>
-            </w:r>
-            <w:r>
-              <w:rPr>
-                <w:i w:val="0"/>
-                <w:color w:val="auto"/>
-              </w:rPr>
-              <w:t>{investigatorNameRank}</w:t>
-            </w:r>
-            <w:r>
-              <w:rPr>
-                <w:i w:val="0"/>
-                <w:color w:val="auto"/>
-              </w:rPr>
-              <w:t xml:space="preserve"> at the scene immediately after the fire, revealed the following:</w:t>
+              <w:t xml:space="preserve">{name}, revealed the following: {facts}</w:t>
             </w:r>
           </w:p>
           <w:p>
@@ -3632,7 +3142,7 @@
               <w:jc w:val="both"/>
               <w:rPr>
                 <w:i w:val="0"/>
-                <w:color w:val="000000"/>
+                <w:color w:val="auto"/>
               </w:rPr>
             </w:pPr>
           </w:p>
@@ -3641,13 +3151,39 @@
               <w:pStyle w:val="BodyText"/>
               <w:numPr>
                 <w:ilvl w:val="0"/>
-                <w:numId w:val="23"/>
+                <w:numId w:val="22"/>
               </w:numPr>
               <w:ind w:left="1065" w:right="412" w:hanging="425"/>
               <w:jc w:val="both"/>
               <w:rPr>
                 <w:i w:val="0"/>
-                <w:color w:val="000000"/>
+                <w:color w:val="auto"/>
+              </w:rPr>
+            </w:pPr>
+          </w:p>
+          <w:p>
+            <w:pPr>
+              <w:pStyle w:val="BodyText"/>
+              <w:ind w:right="412"/>
+              <w:jc w:val="both"/>
+              <w:rPr>
+                <w:i w:val="0"/>
+                <w:color w:val="auto"/>
+              </w:rPr>
+            </w:pPr>
+          </w:p>
+          <w:p>
+            <w:pPr>
+              <w:pStyle w:val="BodyText"/>
+              <w:numPr>
+                <w:ilvl w:val="0"/>
+                <w:numId w:val="22"/>
+              </w:numPr>
+              <w:ind w:left="1065" w:right="412" w:hanging="425"/>
+              <w:jc w:val="both"/>
+              <w:rPr>
+                <w:i w:val="0"/>
+                <w:color w:val="auto"/>
               </w:rPr>
             </w:pPr>
           </w:p>
@@ -3658,7 +3194,7 @@
               <w:jc w:val="both"/>
               <w:rPr>
                 <w:i w:val="0"/>
-                <w:color w:val="000000"/>
+                <w:color w:val="auto"/>
               </w:rPr>
             </w:pPr>
           </w:p>
@@ -3667,50 +3203,24 @@
               <w:pStyle w:val="BodyText"/>
               <w:numPr>
                 <w:ilvl w:val="0"/>
-                <w:numId w:val="23"/>
+                <w:numId w:val="22"/>
               </w:numPr>
               <w:ind w:left="1065" w:right="412" w:hanging="425"/>
               <w:jc w:val="both"/>
               <w:rPr>
                 <w:i w:val="0"/>
-                <w:color w:val="000000"/>
+                <w:color w:val="auto"/>
               </w:rPr>
             </w:pPr>
           </w:p>
           <w:p>
             <w:pPr>
               <w:pStyle w:val="BodyText"/>
-              <w:ind w:left="1065" w:right="412"/>
+              <w:ind w:right="412"/>
               <w:jc w:val="both"/>
               <w:rPr>
                 <w:i w:val="0"/>
-                <w:color w:val="000000"/>
-              </w:rPr>
-            </w:pPr>
-          </w:p>
-          <w:p>
-            <w:pPr>
-              <w:pStyle w:val="BodyText"/>
-              <w:numPr>
-                <w:ilvl w:val="0"/>
-                <w:numId w:val="23"/>
-              </w:numPr>
-              <w:ind w:left="1065" w:right="412" w:hanging="425"/>
-              <w:jc w:val="both"/>
-              <w:rPr>
-                <w:i w:val="0"/>
-                <w:color w:val="000000"/>
-              </w:rPr>
-            </w:pPr>
-          </w:p>
-          <w:p>
-            <w:pPr>
-              <w:pStyle w:val="BodyText"/>
-              <w:ind w:left="1065" w:right="412"/>
-              <w:jc w:val="both"/>
-              <w:rPr>
-                <w:i w:val="0"/>
-                <w:color w:val="000000"/>
+                <w:color w:val="auto"/>
               </w:rPr>
             </w:pPr>
           </w:p>
@@ -3723,9 +3233,6 @@
             <w:bottom w:w="0" w:type="dxa"/>
           </w:tblCellMar>
         </w:tblPrEx>
-        <w:trPr>
-          <w:cantSplit/>
-        </w:trPr>
         <w:tc>
           <w:tcPr>
             <w:tcW w:w="4433" w:type="dxa"/>
@@ -3754,6 +3261,21 @@
             <w:pPr>
               <w:pStyle w:val="Heading3"/>
             </w:pPr>
+          </w:p>
+          <w:p>
+            <w:pPr>
+              <w:rPr>
+                <w:rFonts w:ascii="Arial" w:hAnsi="Arial"/>
+                <w:sz w:val="24"/>
+              </w:rPr>
+            </w:pPr>
+            <w:r>
+              <w:rPr>
+                <w:rFonts w:ascii="Arial" w:hAnsi="Arial"/>
+                <w:sz w:val="24"/>
+              </w:rPr>
+              <w:t>{name}</w:t>
+            </w:r>
           </w:p>
         </w:tc>
       </w:tr>
@@ -3764,9 +3286,6 @@
             <w:bottom w:w="0" w:type="dxa"/>
           </w:tblCellMar>
         </w:tblPrEx>
-        <w:trPr>
-          <w:cantSplit/>
-        </w:trPr>
         <w:tc>
           <w:tcPr>
             <w:tcW w:w="4433" w:type="dxa"/>
@@ -3802,6 +3321,21 @@
                 <w:sz w:val="24"/>
               </w:rPr>
             </w:pPr>
+          </w:p>
+          <w:p>
+            <w:pPr>
+              <w:rPr>
+                <w:rFonts w:ascii="Arial" w:hAnsi="Arial"/>
+                <w:sz w:val="24"/>
+              </w:rPr>
+            </w:pPr>
+            <w:r>
+              <w:rPr>
+                <w:rFonts w:ascii="Arial" w:hAnsi="Arial"/>
+                <w:sz w:val="24"/>
+              </w:rPr>
+              <w:t>{designation}</w:t>
+            </w:r>
           </w:p>
         </w:tc>
       </w:tr>
@@ -3812,9 +3346,6 @@
             <w:bottom w:w="0" w:type="dxa"/>
           </w:tblCellMar>
         </w:tblPrEx>
-        <w:trPr>
-          <w:cantSplit/>
-        </w:trPr>
         <w:tc>
           <w:tcPr>
             <w:tcW w:w="4433" w:type="dxa"/>
@@ -3838,14 +3369,28 @@
                 <w:rFonts w:ascii="Arial" w:hAnsi="Arial"/>
                 <w:sz w:val="24"/>
               </w:rPr>
-              <w:t xml:space="preserve">NRIC </w:t>
-            </w:r>
-            <w:r>
-              <w:rPr>
-                <w:rFonts w:ascii="Arial" w:hAnsi="Arial"/>
-                <w:sz w:val="24"/>
-              </w:rPr>
-              <w:t xml:space="preserve">/ FIN </w:t>
+              <w:t>NRIC</w:t>
+            </w:r>
+            <w:r>
+              <w:rPr>
+                <w:rFonts w:ascii="Arial" w:hAnsi="Arial"/>
+                <w:sz w:val="24"/>
+              </w:rPr>
+              <w:t xml:space="preserve"> /</w:t>
+            </w:r>
+            <w:r>
+              <w:rPr>
+                <w:rFonts w:ascii="Arial" w:hAnsi="Arial"/>
+                <w:sz w:val="24"/>
+              </w:rPr>
+              <w:t xml:space="preserve"> </w:t>
+            </w:r>
+            <w:r>
+              <w:rPr>
+                <w:rFonts w:ascii="Arial" w:hAnsi="Arial"/>
+                <w:sz w:val="24"/>
+              </w:rPr>
+              <w:t xml:space="preserve">FIN </w:t>
             </w:r>
             <w:r>
               <w:rPr>
@@ -3870,6 +3415,21 @@
                 <w:sz w:val="24"/>
               </w:rPr>
             </w:pPr>
+          </w:p>
+          <w:p>
+            <w:pPr>
+              <w:rPr>
+                <w:rFonts w:ascii="Arial" w:hAnsi="Arial"/>
+                <w:sz w:val="24"/>
+              </w:rPr>
+            </w:pPr>
+            <w:r>
+              <w:rPr>
+                <w:rFonts w:ascii="Arial" w:hAnsi="Arial"/>
+                <w:sz w:val="24"/>
+              </w:rPr>
+              <w:t>{nric}</w:t>
+            </w:r>
           </w:p>
         </w:tc>
       </w:tr>
@@ -3880,9 +3440,6 @@
             <w:bottom w:w="0" w:type="dxa"/>
           </w:tblCellMar>
         </w:tblPrEx>
-        <w:trPr>
-          <w:cantSplit/>
-        </w:trPr>
         <w:tc>
           <w:tcPr>
             <w:tcW w:w="4433" w:type="dxa"/>
@@ -3921,6 +3478,21 @@
                 <w:sz w:val="24"/>
               </w:rPr>
             </w:pPr>
+          </w:p>
+          <w:p>
+            <w:pPr>
+              <w:rPr>
+                <w:rFonts w:ascii="Arial" w:hAnsi="Arial"/>
+                <w:sz w:val="24"/>
+              </w:rPr>
+            </w:pPr>
+            <w:r>
+              <w:rPr>
+                <w:rFonts w:ascii="Arial" w:hAnsi="Arial"/>
+                <w:sz w:val="24"/>
+              </w:rPr>
+              <w:t>{nationality}</w:t>
+            </w:r>
           </w:p>
         </w:tc>
       </w:tr>
@@ -3931,9 +3503,6 @@
             <w:bottom w:w="0" w:type="dxa"/>
           </w:tblCellMar>
         </w:tblPrEx>
-        <w:trPr>
-          <w:cantSplit/>
-        </w:trPr>
         <w:tc>
           <w:tcPr>
             <w:tcW w:w="4433" w:type="dxa"/>
@@ -3974,6 +3543,21 @@
                 <w:szCs w:val="24"/>
               </w:rPr>
             </w:pPr>
+          </w:p>
+          <w:p>
+            <w:pPr>
+              <w:rPr>
+                <w:rFonts w:ascii="Arial" w:hAnsi="Arial"/>
+                <w:sz w:val="24"/>
+              </w:rPr>
+            </w:pPr>
+            <w:r>
+              <w:rPr>
+                <w:rFonts w:ascii="Arial" w:hAnsi="Arial"/>
+                <w:sz w:val="24"/>
+              </w:rPr>
+              <w:t>{address}</w:t>
+            </w:r>
           </w:p>
         </w:tc>
       </w:tr>
@@ -3984,9 +3568,6 @@
             <w:bottom w:w="0" w:type="dxa"/>
           </w:tblCellMar>
         </w:tblPrEx>
-        <w:trPr>
-          <w:cantSplit/>
-        </w:trPr>
         <w:tc>
           <w:tcPr>
             <w:tcW w:w="4433" w:type="dxa"/>
@@ -4003,7 +3584,14 @@
                 <w:rFonts w:ascii="Arial" w:hAnsi="Arial"/>
                 <w:sz w:val="24"/>
               </w:rPr>
-              <w:t xml:space="preserve">   Contact No.</w:t>
+              <w:t xml:space="preserve">   </w:t>
+            </w:r>
+            <w:r>
+              <w:rPr>
+                <w:rFonts w:ascii="Arial" w:hAnsi="Arial"/>
+                <w:sz w:val="24"/>
+              </w:rPr>
+              <w:t>Contact No.</w:t>
             </w:r>
           </w:p>
         </w:tc>
@@ -4013,44 +3601,36 @@
           </w:tcPr>
           <w:p>
             <w:pPr>
-              <w:suppressAutoHyphens/>
-              <w:rPr>
-                <w:rFonts w:ascii="Arial" w:hAnsi="Arial" w:cs="Arial"/>
-                <w:sz w:val="24"/>
-                <w:szCs w:val="24"/>
-              </w:rPr>
-            </w:pPr>
-            <w:r>
-              <w:rPr>
-                <w:rFonts w:ascii="Arial" w:hAnsi="Arial" w:cs="Arial"/>
-                <w:sz w:val="24"/>
-                <w:szCs w:val="24"/>
-              </w:rPr>
-              <w:t>(M</w:t>
-            </w:r>
-            <w:r>
-              <w:rPr>
-                <w:rFonts w:ascii="Arial" w:hAnsi="Arial" w:cs="Arial"/>
-                <w:sz w:val="24"/>
-                <w:szCs w:val="24"/>
-              </w:rPr>
-              <w:t>obile</w:t>
-            </w:r>
-            <w:r>
-              <w:rPr>
-                <w:rFonts w:ascii="Arial" w:hAnsi="Arial" w:cs="Arial"/>
-                <w:sz w:val="24"/>
-                <w:szCs w:val="24"/>
-              </w:rPr>
-              <w:t>)</w:t>
-            </w:r>
-            <w:r>
-              <w:rPr>
-                <w:rFonts w:ascii="Arial" w:hAnsi="Arial" w:cs="Arial"/>
-                <w:sz w:val="24"/>
-                <w:szCs w:val="24"/>
-              </w:rPr>
-              <w:t xml:space="preserve"> (Home) (Office)</w:t>
+              <w:rPr>
+                <w:rFonts w:ascii="Arial" w:hAnsi="Arial"/>
+                <w:sz w:val="24"/>
+              </w:rPr>
+            </w:pPr>
+            <w:r>
+              <w:rPr>
+                <w:rFonts w:ascii="Arial" w:hAnsi="Arial"/>
+                <w:sz w:val="24"/>
+              </w:rPr>
+              <w:t>(Mobile) {contactMobile}</w:t>
+            </w:r>
+            <w:r>
+              <w:rPr>
+                <w:rFonts w:ascii="Arial" w:hAnsi="Arial"/>
+                <w:sz w:val="24"/>
+              </w:rPr>
+              <w:t xml:space="preserve"> (Home) {contactHome} (Office) {contactOffice}</w:t>
+            </w:r>
+          </w:p>
+        </w:tc>
+      </w:tr>
+      <w:tr>
+        <w:tc>
+          <w:tcPr>
+            <w:gridSpan w:val="2"/>
+          </w:tcPr>
+          <w:p>
+            <w:r>
+              <w:t>{/interviewees}</w:t>
             </w:r>
           </w:p>
         </w:tc>

</xml_diff>